<commit_message>
Added Artist feature and community feature along with the like and comments
</commit_message>
<xml_diff>
--- a/digital art gallery.docx
+++ b/digital art gallery.docx
@@ -875,6 +875,7 @@
               <w:rPr>
                 <w:rFonts w:cs="Times New Roman"/>
                 <w:color w:val="000000"/>
+                <w:highlight w:val="yellow"/>
               </w:rPr>
               <w:t>Google / Facebook</w:t>
             </w:r>
@@ -1210,7 +1211,13 @@
           <w:p/>
           <w:p>
             <w:r>
-              <w:t xml:space="preserve">Google / Facebook </w:t>
+              <w:rPr>
+                <w:highlight w:val="yellow"/>
+              </w:rPr>
+              <w:t>Google / Facebook</w:t>
+            </w:r>
+            <w:r>
+              <w:t xml:space="preserve"> </w:t>
             </w:r>
           </w:p>
         </w:tc>
@@ -1258,6 +1265,9 @@
           <w:p/>
           <w:p>
             <w:r>
+              <w:rPr>
+                <w:highlight w:val="yellow"/>
+              </w:rPr>
               <w:t>Google / Facebook</w:t>
             </w:r>
           </w:p>
@@ -1610,7 +1620,13 @@
           <w:p/>
           <w:p>
             <w:r>
-              <w:t xml:space="preserve">User Google/ Facebook authentication </w:t>
+              <w:rPr>
+                <w:highlight w:val="yellow"/>
+              </w:rPr>
+              <w:t>User Google/ Facebook authentication</w:t>
+            </w:r>
+            <w:r>
+              <w:t xml:space="preserve"> </w:t>
             </w:r>
           </w:p>
         </w:tc>
@@ -1729,7 +1745,13 @@
           <w:p/>
           <w:p>
             <w:r>
-              <w:t xml:space="preserve">Art Categories </w:t>
+              <w:rPr>
+                <w:highlight w:val="yellow"/>
+              </w:rPr>
+              <w:t>Art Categories</w:t>
+            </w:r>
+            <w:r>
+              <w:t xml:space="preserve"> </w:t>
             </w:r>
           </w:p>
         </w:tc>
@@ -1782,6 +1804,9 @@
           <w:p/>
           <w:p>
             <w:r>
+              <w:rPr>
+                <w:highlight w:val="yellow"/>
+              </w:rPr>
               <w:t>Art Categories UI</w:t>
             </w:r>
           </w:p>
@@ -1838,9 +1863,15 @@
           <w:p/>
           <w:p>
             <w:r>
+              <w:rPr>
+                <w:highlight w:val="yellow"/>
+              </w:rPr>
               <w:t>Artwork</w:t>
             </w:r>
             <w:r>
+              <w:rPr>
+                <w:highlight w:val="yellow"/>
+              </w:rPr>
               <w:t xml:space="preserve"> Details Page</w:t>
             </w:r>
           </w:p>
@@ -1901,9 +1932,15 @@
           <w:p/>
           <w:p>
             <w:r>
+              <w:rPr>
+                <w:highlight w:val="yellow"/>
+              </w:rPr>
               <w:t>Artwork</w:t>
             </w:r>
             <w:r>
+              <w:rPr>
+                <w:highlight w:val="yellow"/>
+              </w:rPr>
               <w:t xml:space="preserve"> Detail Page UI</w:t>
             </w:r>
           </w:p>
@@ -2062,6 +2099,9 @@
           <w:p/>
           <w:p>
             <w:r>
+              <w:rPr>
+                <w:highlight w:val="yellow"/>
+              </w:rPr>
               <w:t>Like and Comment UI</w:t>
             </w:r>
           </w:p>
@@ -2098,6 +2138,9 @@
           <w:p/>
           <w:p>
             <w:r>
+              <w:rPr>
+                <w:highlight w:val="yellow"/>
+              </w:rPr>
               <w:t>API</w:t>
             </w:r>
           </w:p>
@@ -2139,6 +2182,9 @@
           <w:p/>
           <w:p>
             <w:r>
+              <w:rPr>
+                <w:highlight w:val="yellow"/>
+              </w:rPr>
               <w:t>Like and Comment UI</w:t>
             </w:r>
           </w:p>
@@ -2218,6 +2264,9 @@
           <w:p/>
           <w:p>
             <w:r>
+              <w:rPr>
+                <w:highlight w:val="yellow"/>
+              </w:rPr>
               <w:t>Follow Artist UI</w:t>
             </w:r>
           </w:p>
@@ -2424,10 +2473,14 @@
               <w:rPr>
                 <w:sz w:val="24"/>
                 <w:szCs w:val="24"/>
+                <w:highlight w:val="yellow"/>
               </w:rPr>
               <w:t xml:space="preserve">User </w:t>
             </w:r>
             <w:r>
+              <w:rPr>
+                <w:highlight w:val="yellow"/>
+              </w:rPr>
               <w:t>profiles UI</w:t>
             </w:r>
           </w:p>
@@ -2542,6 +2595,7 @@
               <w:rPr>
                 <w:sz w:val="24"/>
                 <w:szCs w:val="24"/>
+                <w:highlight w:val="yellow"/>
               </w:rPr>
               <w:t>Artist Profile  UI</w:t>
             </w:r>
@@ -2663,6 +2717,7 @@
               <w:rPr>
                 <w:sz w:val="24"/>
                 <w:szCs w:val="24"/>
+                <w:highlight w:val="yellow"/>
               </w:rPr>
               <w:t>API</w:t>
             </w:r>
@@ -2896,20 +2951,29 @@
             <w:r>
               <w:rPr>
                 <w:szCs w:val="24"/>
+                <w:highlight w:val="yellow"/>
               </w:rPr>
               <w:t xml:space="preserve">Create </w:t>
             </w:r>
             <w:r>
               <w:rPr>
                 <w:szCs w:val="24"/>
+                <w:highlight w:val="yellow"/>
               </w:rPr>
               <w:t>Api</w:t>
             </w:r>
             <w:r>
               <w:rPr>
                 <w:szCs w:val="24"/>
-              </w:rPr>
-              <w:t xml:space="preserve"> for art list show.</w:t>
+                <w:highlight w:val="yellow"/>
+              </w:rPr>
+              <w:t xml:space="preserve"> for art list show</w:t>
+            </w:r>
+            <w:r>
+              <w:rPr>
+                <w:szCs w:val="24"/>
+              </w:rPr>
+              <w:t>.</w:t>
             </w:r>
           </w:p>
         </w:tc>

</xml_diff>